<commit_message>
Complete Week 3 testing and deployment setup
</commit_message>
<xml_diff>
--- a/submit/AI使用说明与反思报告.docx
+++ b/submit/AI使用说明与反思报告.docx
@@ -152,7 +152,7 @@
                 <w:color w:val="111827"/>
                 <w:sz w:val="20"/>
               </w:rPr>
-              <w:t>2026 年 9 月 19 日</w:t>
+              <w:t>2026 年 9 月 20 日</w:t>
             </w:r>
           </w:p>
         </w:tc>
@@ -884,7 +884,7 @@
                 <w:rFonts w:ascii="PingFang SC" w:hAnsi="PingFang SC" w:eastAsia="PingFang SC"/>
                 <w:sz w:val="16"/>
               </w:rPr>
-              <w:t>13 项用例实际执行通过</w:t>
+              <w:t>Week 3 接口 14 项、全量 29 项实际执行通过</w:t>
             </w:r>
           </w:p>
         </w:tc>
@@ -1456,7 +1456,7 @@
                 <w:rFonts w:ascii="PingFang SC" w:hAnsi="PingFang SC" w:eastAsia="PingFang SC"/>
                 <w:sz w:val="17"/>
               </w:rPr>
-              <w:t>BGE Embedding + FAISS 向量检索；TF-IDF 仅作回退基线</w:t>
+              <w:t>BGE Embedding + FAISS 向量检索；这是唯一正式 RAG 实现</w:t>
             </w:r>
           </w:p>
         </w:tc>
@@ -1481,7 +1481,7 @@
                 <w:rFonts w:ascii="PingFang SC" w:hAnsi="PingFang SC" w:eastAsia="PingFang SC"/>
                 <w:sz w:val="17"/>
               </w:rPr>
-              <w:t>不把 TF-IDF 称为深度学习；规则金标准不等同人工标注 Recall</w:t>
+              <w:t>索引或模型不可用时直接报错；TF-IDF 仅用于人岗匹配或历史对照，不参与 RAG</w:t>
             </w:r>
           </w:p>
         </w:tc>
@@ -1531,7 +1531,7 @@
                 <w:rFonts w:ascii="PingFang SC" w:hAnsi="PingFang SC" w:eastAsia="PingFang SC"/>
                 <w:sz w:val="17"/>
               </w:rPr>
-              <w:t>真实 OpenAI-compatible 模型负责理解和工具选择，本地 Python 工具执行</w:t>
+              <w:t>gpt-5.6-sol 通过 Responses API 完成 Function Calling，本地 Python 工具执行</w:t>
             </w:r>
           </w:p>
         </w:tc>

</xml_diff>